<commit_message>
Refactor and Installed Vite
</commit_message>
<xml_diff>
--- a/Assignment 7/assignment 7-react wordle redux part 2-1.docx
+++ b/Assignment 7/assignment 7-react wordle redux part 2-1.docx
@@ -415,6 +415,16 @@
       <w:proofErr w:type="spellEnd"/>
     </w:p>
     <w:p>
+      <w:hyperlink r:id="rId8" w:history="1">
+        <w:r>
+          <w:rPr>
+            <w:rStyle w:val="Hyperlink"/>
+          </w:rPr>
+          <w:t>https://pochat.github.io/harvard-dgmd-e-28/Assignment%207/jsx-wordle-redux.html</w:t>
+        </w:r>
+      </w:hyperlink>
+    </w:p>
+    <w:p>
       <w:r>
         <w:t>Copy of the code</w:t>
       </w:r>
@@ -543,7 +553,7 @@
       </w:r>
     </w:p>
     <w:sectPr>
-      <w:footerReference w:type="default" r:id="rId8"/>
+      <w:footerReference w:type="default" r:id="rId9"/>
       <w:pgSz w:w="12240" w:h="15840" w:code="1"/>
       <w:pgMar w:top="864" w:right="1008" w:bottom="1152" w:left="1008" w:header="720" w:footer="864" w:gutter="0"/>
       <w:cols w:space="720"/>

</xml_diff>